<commit_message>
Align docx with implementation: rename village_farewell→final_ending, fix card count 20→23, add village_exit/village_trace prompts, clarify restartGame flow
</commit_message>
<xml_diff>
--- a/桃花源記後篇任務單・桃花村施工.docx
+++ b/桃花源記後篇任務單・桃花村施工.docx
@@ -472,83 +472,35 @@
     <w:p>
       <w:proofErr w:type="gramStart"/>
       <w:r>
-        <w:t>本關必要</w:t>
-      </w:r>
-      <w:proofErr w:type="gramEnd"/>
-      <w:r>
-        <w:t>資產：</w:t>
-      </w:r>
-      <w:r>
-        <w:t>village_full.png</w:t>
-      </w:r>
-      <w:r>
-        <w:t>、</w:t>
-      </w:r>
-      <w:r>
-        <w:t>npc_elder.png</w:t>
-      </w:r>
-      <w:r>
-        <w:t>、</w:t>
-      </w:r>
-      <w:r>
-        <w:t>npc_farmer.png</w:t>
-      </w:r>
-      <w:r>
-        <w:t>、</w:t>
-      </w:r>
-      <w:r>
-        <w:t>obj_well.png</w:t>
-      </w:r>
-      <w:r>
-        <w:t>、</w:t>
-      </w:r>
-      <w:r>
-        <w:t>obj_feast.png</w:t>
-      </w:r>
-      <w:r>
-        <w:t>、</w:t>
-      </w:r>
-      <w:r>
-        <w:t>farmhouse_interior.png</w:t>
-      </w:r>
-      <w:r>
-        <w:t>、</w:t>
-      </w:r>
-      <w:r>
-        <w:t>npc_villager_humble.png</w:t>
-      </w:r>
-      <w:r>
-        <w:t>、</w:t>
-      </w:r>
-      <w:r>
-        <w:t>village_farewell.png</w:t>
-      </w:r>
-      <w:r>
-        <w:t>（結局，含文字）、</w:t>
-      </w:r>
-      <w:r>
-        <w:t>card-base-source.png</w:t>
-      </w:r>
-      <w:r>
-        <w:t>（沿用前作可不重生）、</w:t>
-      </w:r>
-      <w:r>
-        <w:t xml:space="preserve">cards/ </w:t>
-      </w:r>
-      <w:r>
-        <w:t>桃花</w:t>
-      </w:r>
-      <w:proofErr w:type="gramStart"/>
-      <w:r>
-        <w:t>村字詞卡</w:t>
-      </w:r>
-      <w:proofErr w:type="gramEnd"/>
-      <w:r>
-        <w:t xml:space="preserve"> 20 </w:t>
-      </w:r>
-      <w:r>
-        <w:t>張。</w:t>
-      </w:r>
+        <w:t>本關必要資產：village_full.png、npc_elder.png、npc_farmer.png、obj_well.png、obj_feast.png、farmhouse_interior.png、npc_villager_humble.png、village_exit.png、village_trace.png、final_ending.png（結局，含文字）、card-base-source.png（沿用前作可不重生）、cards/ 桃花村字詞卡 23 張。</w:t>
+      </w:r>
+      <w:proofErr w:type="gramEnd"/>
+      <w:r/>
+      <w:r/>
+      <w:r/>
+      <w:r/>
+      <w:r/>
+      <w:r/>
+      <w:r/>
+      <w:r/>
+      <w:r/>
+      <w:r/>
+      <w:r/>
+      <w:r/>
+      <w:r/>
+      <w:r/>
+      <w:r/>
+      <w:r/>
+      <w:r/>
+      <w:r/>
+      <w:r/>
+      <w:r/>
+      <w:r/>
+      <w:proofErr w:type="gramStart"/>
+      <w:r/>
+      <w:proofErr w:type="gramEnd"/>
+      <w:r/>
+      <w:r/>
     </w:p>
     <w:p>
       <w:r>
@@ -557,52 +509,28 @@
     </w:p>
     <w:p>
       <w:r>
-        <w:t>傳統中國</w:t>
-      </w:r>
-      <w:proofErr w:type="gramStart"/>
-      <w:r>
-        <w:t>水墨淡彩繪</w:t>
-      </w:r>
-      <w:proofErr w:type="gramEnd"/>
-      <w:r>
-        <w:t>本插畫，融合宋代山水的留白意境與現代數位繪本的細膩質感。米黃色宣紙肌理背景，墨線輕盈靈動，色彩以柔和的青綠、赭石、胭脂粉為主，層次豐富。遠景</w:t>
-      </w:r>
-      <w:proofErr w:type="gramStart"/>
-      <w:r>
-        <w:t>淡墨暈染</w:t>
-      </w:r>
-      <w:proofErr w:type="gramEnd"/>
-      <w:r>
-        <w:t>、中景</w:t>
-      </w:r>
-      <w:proofErr w:type="gramStart"/>
-      <w:r>
-        <w:t>清晰、</w:t>
-      </w:r>
-      <w:proofErr w:type="gramEnd"/>
-      <w:r>
-        <w:t>近景有細節筆觸，空氣感與光線通透。構圖講究、富有電影感，氣氛詩意悠遠。</w:t>
-      </w:r>
-      <w:r>
-        <w:t xml:space="preserve">16:9 </w:t>
-      </w:r>
-      <w:r>
-        <w:t>橫向，高解析度，精緻華麗。除</w:t>
-      </w:r>
-      <w:r>
-        <w:t xml:space="preserve"> village_farewell.png </w:t>
-      </w:r>
-      <w:r>
-        <w:t>外，其餘場景圖與</w:t>
-      </w:r>
-      <w:proofErr w:type="gramStart"/>
-      <w:r>
-        <w:t>立繪不得</w:t>
-      </w:r>
-      <w:proofErr w:type="gramEnd"/>
-      <w:r>
-        <w:t>含任何文字。</w:t>
-      </w:r>
+        <w:t>傳統中國水墨淡彩繪本插畫，融合宋代山水的留白意境與現代數位繪本的細膩質感。米黃色宣紙肌理背景，墨線輕盈靈動，色彩以柔和的青綠、赭石、胭脂粉為主，層次豐富。遠景淡墨暈染、中景清晰、近景有細節筆觸，空氣感與光線通透。構圖講究、富有電影感，氣氛詩意悠遠。16:9 橫向，高解析度，精緻華麗。除 final_ending.png 外，其餘場景圖與立繪不得含任何文字。</w:t>
+      </w:r>
+      <w:proofErr w:type="gramStart"/>
+      <w:r/>
+      <w:proofErr w:type="gramEnd"/>
+      <w:r/>
+      <w:proofErr w:type="gramStart"/>
+      <w:r/>
+      <w:proofErr w:type="gramEnd"/>
+      <w:r/>
+      <w:proofErr w:type="gramStart"/>
+      <w:r/>
+      <w:proofErr w:type="gramEnd"/>
+      <w:r/>
+      <w:r/>
+      <w:r/>
+      <w:r/>
+      <w:r/>
+      <w:proofErr w:type="gramStart"/>
+      <w:r/>
+      <w:proofErr w:type="gramEnd"/>
+      <w:r/>
     </w:p>
     <w:p>
       <w:r>
@@ -958,6 +886,21 @@
     </w:p>
     <w:p>
       <w:r>
+        <w:t xml:space="preserve">village_trace.png（沿路做記號） 漁人沿著回程的溪流邊小徑前進、不時駐足在岸邊石上或樹幹做記號的場景。視角為略帶俯瞰的電影長鏡頭，可見蜿蜒小徑、零星桃花、淡墨遠山與微光晨霧，畫面下方留出空曠溪面便於排句卡片散落。作為結局排句的場景背景，不含任何文字。〔接共用風格基底〕</w:t>
+      </w:r>
+    </w:p>
+    <w:p>
+      <w:r>
+        <w:t xml:space="preserve">village_exit.png（離村過場） 桃花村村口的離別場景：夕陽斜照，村門半掩，幾位村民立於門前拱手相送，漁人的小舟靜泊溪邊，桃花輕輕飄落。色調溫暖中帶一絲離愁，氣氛不悲，留白足。作為「辭去」之後、做記號之前的過場主圖，不含任何文字。〔接共用風格基底〕</w:t>
+      </w:r>
+    </w:p>
+    <w:p>
+      <w:r>
+        <w:t xml:space="preserve">過場 / 結局前序場景（與本關流程一致，與前作風格統一）</w:t>
+      </w:r>
+    </w:p>
+    <w:p>
+      <w:r>
         <w:t>結局頁</w:t>
       </w:r>
       <w:proofErr w:type="gramStart"/>
@@ -979,17 +922,11 @@
     </w:p>
     <w:p>
       <w:r>
-        <w:t xml:space="preserve">village_farewell.png </w:t>
-      </w:r>
-      <w:r>
-        <w:t>製作一張</w:t>
-      </w:r>
-      <w:r>
-        <w:t xml:space="preserve"> 16:9 </w:t>
-      </w:r>
-      <w:r>
-        <w:t>橫式遊戲結局插圖，主題是《桃花源記》漁人辭別桃花源。</w:t>
-      </w:r>
+        <w:t>final_ending.png 製作一張 16:9 橫式遊戲結局插圖，主題是《桃花源記》漁人辭別桃花源。</w:t>
+      </w:r>
+      <w:r/>
+      <w:r/>
+      <w:r/>
     </w:p>
     <w:p>
       <w:r>
@@ -1305,78 +1242,38 @@
     <w:p>
       <w:proofErr w:type="gramStart"/>
       <w:r>
-        <w:t>桃花村字詞</w:t>
-      </w:r>
-      <w:proofErr w:type="gramEnd"/>
-      <w:r>
-        <w:t>卡片尺寸清單</w:t>
-      </w:r>
-      <w:proofErr w:type="gramStart"/>
-      <w:r>
-        <w:t>（</w:t>
-      </w:r>
-      <w:proofErr w:type="gramEnd"/>
-      <w:r>
-        <w:t>共</w:t>
-      </w:r>
-      <w:r>
-        <w:t xml:space="preserve"> 20 </w:t>
-      </w:r>
-      <w:r>
-        <w:t>張，高度統一</w:t>
-      </w:r>
-      <w:r>
-        <w:t xml:space="preserve"> 156px</w:t>
-      </w:r>
-      <w:r>
-        <w:t>；</w:t>
-      </w:r>
-      <w:r>
-        <w:t xml:space="preserve">3 </w:t>
-      </w:r>
-      <w:r>
-        <w:t>字</w:t>
-      </w:r>
-      <w:proofErr w:type="gramStart"/>
-      <w:r>
-        <w:t>詞卡寬</w:t>
-      </w:r>
-      <w:proofErr w:type="gramEnd"/>
-      <w:r>
-        <w:t xml:space="preserve"> 450px</w:t>
-      </w:r>
-      <w:r>
-        <w:t>、</w:t>
-      </w:r>
-      <w:r>
-        <w:t>4</w:t>
-      </w:r>
-      <w:proofErr w:type="gramStart"/>
-      <w:r>
-        <w:t>–</w:t>
-      </w:r>
-      <w:proofErr w:type="gramEnd"/>
-      <w:r>
-        <w:t xml:space="preserve">5 </w:t>
-      </w:r>
-      <w:r>
-        <w:t>字</w:t>
-      </w:r>
-      <w:proofErr w:type="gramStart"/>
-      <w:r>
-        <w:t>詞卡寬</w:t>
-      </w:r>
-      <w:proofErr w:type="gramEnd"/>
-      <w:r>
-        <w:t xml:space="preserve"> 520px</w:t>
-      </w:r>
-      <w:r>
-        <w:t>，與前作規則一致</w:t>
-      </w:r>
-      <w:proofErr w:type="gramStart"/>
-      <w:r>
-        <w:t>）</w:t>
-      </w:r>
+        <w:t>桃花村字詞卡片尺寸清單（共 23 張，高度統一 156px；3 字詞卡寬 450px、4–5 字詞卡寬 520px，與前作規則一致）</w:t>
+      </w:r>
+      <w:proofErr w:type="gramEnd"/>
+      <w:r/>
+      <w:proofErr w:type="gramStart"/>
+      <w:r/>
+      <w:proofErr w:type="gramEnd"/>
+      <w:r/>
+      <w:r/>
+      <w:r/>
+      <w:r/>
+      <w:r/>
+      <w:r/>
+      <w:r/>
+      <w:proofErr w:type="gramStart"/>
+      <w:r/>
+      <w:proofErr w:type="gramEnd"/>
+      <w:r/>
+      <w:r/>
+      <w:r/>
+      <w:proofErr w:type="gramStart"/>
+      <w:r/>
+      <w:proofErr w:type="gramEnd"/>
+      <w:r/>
+      <w:r/>
+      <w:proofErr w:type="gramStart"/>
+      <w:r/>
+      <w:proofErr w:type="gramEnd"/>
+      <w:r/>
+      <w:r/>
+      <w:proofErr w:type="gramStart"/>
+      <w:r/>
       <w:proofErr w:type="gramEnd"/>
     </w:p>
     <w:p>
@@ -2004,87 +1901,38 @@
     </w:p>
     <w:p>
       <w:r>
-        <w:t>卡片總數：</w:t>
-      </w:r>
-      <w:r>
-        <w:t xml:space="preserve">4 + 3 + 4 + 3 + 4 + 5 = 23 </w:t>
-      </w:r>
-      <w:r>
-        <w:t>張。</w:t>
-      </w:r>
-      <w:proofErr w:type="gramStart"/>
-      <w:r>
-        <w:t>（</w:t>
-      </w:r>
-      <w:proofErr w:type="gramEnd"/>
-      <w:r>
-        <w:t>若要嚴格對齊「</w:t>
-      </w:r>
-      <w:r>
-        <w:t xml:space="preserve">20 </w:t>
-      </w:r>
-      <w:r>
-        <w:t>張」，可將結局</w:t>
-      </w:r>
-      <w:r>
-        <w:t xml:space="preserve"> 5 </w:t>
-      </w:r>
-      <w:r>
-        <w:lastRenderedPageBreak/>
-        <w:t>張另計為</w:t>
-      </w:r>
-      <w:r>
-        <w:t xml:space="preserve"> end </w:t>
-      </w:r>
-      <w:r>
-        <w:t>組；</w:t>
-      </w:r>
-      <w:proofErr w:type="gramStart"/>
-      <w:r>
-        <w:t>本關互動</w:t>
-      </w:r>
-      <w:proofErr w:type="gramEnd"/>
-      <w:r>
-        <w:t>點</w:t>
-      </w:r>
-      <w:r>
-        <w:t xml:space="preserve"> 1~5 </w:t>
-      </w:r>
-      <w:r>
-        <w:t>合計</w:t>
-      </w:r>
-      <w:r>
-        <w:t xml:space="preserve"> 18 </w:t>
-      </w:r>
-      <w:r>
-        <w:t>張</w:t>
-      </w:r>
-      <w:r>
-        <w:t xml:space="preserve"> + </w:t>
-      </w:r>
-      <w:r>
-        <w:t>結局</w:t>
-      </w:r>
-      <w:r>
-        <w:t xml:space="preserve"> 5 </w:t>
-      </w:r>
-      <w:r>
-        <w:t>張</w:t>
-      </w:r>
-      <w:r>
-        <w:t xml:space="preserve"> = 23 </w:t>
-      </w:r>
-      <w:r>
-        <w:t>張，依實際關卡數為</w:t>
-      </w:r>
-      <w:proofErr w:type="gramStart"/>
-      <w:r>
-        <w:t>準</w:t>
-      </w:r>
-      <w:proofErr w:type="gramEnd"/>
-      <w:r>
-        <w:t>。）</w:t>
-      </w:r>
+        <w:t>卡片總數：v1(4) + v2(3) + v3(4) + v4(3) + v5(4) + end(5) = 23 張。</w:t>
+      </w:r>
+      <w:r/>
+      <w:r/>
+      <w:proofErr w:type="gramStart"/>
+      <w:r/>
+      <w:proofErr w:type="gramEnd"/>
+      <w:r/>
+      <w:r/>
+      <w:r/>
+      <w:r/>
+      <w:r/>
+      <w:r/>
+      <w:r/>
+      <w:proofErr w:type="gramStart"/>
+      <w:r/>
+      <w:proofErr w:type="gramEnd"/>
+      <w:r/>
+      <w:r/>
+      <w:r/>
+      <w:r/>
+      <w:r/>
+      <w:r/>
+      <w:r/>
+      <w:r/>
+      <w:r/>
+      <w:r/>
+      <w:r/>
+      <w:proofErr w:type="gramStart"/>
+      <w:r/>
+      <w:proofErr w:type="gramEnd"/>
+      <w:r/>
     </w:p>
     <w:p>
       <w:r>
@@ -3114,96 +2962,79 @@
     </w:p>
     <w:p>
       <w:r>
-        <w:lastRenderedPageBreak/>
-        <w:t>排對後</w:t>
+        <w:t>排對後 → 進入第八節結局段（先做最後一道結局排句，再呈現結局頁）。</w:t>
+      </w:r>
+      <w:r/>
+      <w:r/>
+    </w:p>
+    <w:p>
+      <w:r>
+        <w:t>八、結局（與前作村口同款，圖內含文字</w:t>
+      </w:r>
+      <w:r>
+        <w:t xml:space="preserve"> + </w:t>
+      </w:r>
+      <w:r>
+        <w:t>一道排句）</w:t>
+      </w:r>
+    </w:p>
+    <w:p>
+      <w:r>
+        <w:t>進入結局先做一道排句：顯示 final_ending.png 作為背景（或先以暖光過場），畫面散落最後一組字詞卡片，底部橫向答題框，玩家排出最後一句。</w:t>
+      </w:r>
+      <w:proofErr w:type="gramStart"/>
+      <w:r/>
+      <w:proofErr w:type="gramEnd"/>
+      <w:r/>
+      <w:r/>
+      <w:r/>
+      <w:proofErr w:type="gramStart"/>
+      <w:r/>
+      <w:proofErr w:type="gramEnd"/>
+      <w:r/>
+    </w:p>
+    <w:p>
+      <w:proofErr w:type="gramStart"/>
+      <w:r>
+        <w:t>結局排句答案</w:t>
+      </w:r>
+      <w:proofErr w:type="gramEnd"/>
+      <w:r>
+        <w:t>：既出</w:t>
       </w:r>
       <w:r>
         <w:t xml:space="preserve"> → </w:t>
       </w:r>
       <w:r>
-        <w:t>進入結局。</w:t>
-      </w:r>
-    </w:p>
-    <w:p>
-      <w:r>
-        <w:t>八、結局（與前作村口同款，圖內含文字</w:t>
-      </w:r>
-      <w:r>
-        <w:t xml:space="preserve"> + </w:t>
-      </w:r>
-      <w:r>
-        <w:t>一道排句）</w:t>
-      </w:r>
-    </w:p>
-    <w:p>
-      <w:r>
-        <w:t>進入結局先做</w:t>
-      </w:r>
-      <w:proofErr w:type="gramStart"/>
-      <w:r>
-        <w:t>一道排句</w:t>
-      </w:r>
-      <w:proofErr w:type="gramEnd"/>
-      <w:r>
-        <w:t>：顯示</w:t>
-      </w:r>
-      <w:r>
-        <w:t xml:space="preserve"> village_farewell.png </w:t>
-      </w:r>
-      <w:r>
-        <w:t>作為背景（或先以暖光過場），畫面散落最後一組字詞卡片，底部橫向</w:t>
-      </w:r>
-      <w:proofErr w:type="gramStart"/>
-      <w:r>
-        <w:t>答題框</w:t>
-      </w:r>
-      <w:proofErr w:type="gramEnd"/>
-      <w:r>
-        <w:t>，玩家排出最後一句。</w:t>
-      </w:r>
-    </w:p>
-    <w:p>
-      <w:proofErr w:type="gramStart"/>
-      <w:r>
-        <w:t>結局排句答案</w:t>
-      </w:r>
-      <w:proofErr w:type="gramEnd"/>
-      <w:r>
-        <w:t>：既出</w:t>
+        <w:t>處處</w:t>
+      </w:r>
+      <w:proofErr w:type="gramStart"/>
+      <w:r>
+        <w:t>誌</w:t>
+      </w:r>
+      <w:proofErr w:type="gramEnd"/>
+      <w:r>
+        <w:t>之</w:t>
       </w:r>
       <w:r>
         <w:t xml:space="preserve"> → </w:t>
       </w:r>
-      <w:r>
-        <w:t>處處</w:t>
-      </w:r>
-      <w:proofErr w:type="gramStart"/>
-      <w:r>
-        <w:t>誌</w:t>
-      </w:r>
-      <w:proofErr w:type="gramEnd"/>
-      <w:r>
-        <w:t>之</w:t>
-      </w:r>
+      <w:proofErr w:type="gramStart"/>
+      <w:r>
+        <w:t>尋向所誌</w:t>
+      </w:r>
+      <w:proofErr w:type="gramEnd"/>
       <w:r>
         <w:t xml:space="preserve"> → </w:t>
       </w:r>
       <w:proofErr w:type="gramStart"/>
       <w:r>
-        <w:t>尋向所誌</w:t>
+        <w:t>遂迷</w:t>
       </w:r>
       <w:proofErr w:type="gramEnd"/>
       <w:r>
         <w:t xml:space="preserve"> → </w:t>
       </w:r>
-      <w:proofErr w:type="gramStart"/>
-      <w:r>
-        <w:t>遂迷</w:t>
-      </w:r>
-      <w:proofErr w:type="gramEnd"/>
-      <w:r>
-        <w:t xml:space="preserve"> → </w:t>
-      </w:r>
       <w:r>
         <w:t>不復得路</w:t>
       </w:r>
@@ -3222,39 +3053,21 @@
     </w:p>
     <w:p>
       <w:r>
-        <w:t>排對後，呈現完整結局頁</w:t>
-      </w:r>
-      <w:r>
-        <w:t xml:space="preserve"> village_farewell.png</w:t>
-      </w:r>
-      <w:r>
-        <w:t>（圖內已含「不足為外人道也」與「點擊重遊桃花源」），</w:t>
-      </w:r>
-      <w:proofErr w:type="gramStart"/>
-      <w:r>
-        <w:t>不另疊</w:t>
-      </w:r>
-      <w:proofErr w:type="gramEnd"/>
-      <w:r>
-        <w:t xml:space="preserve"> HTML </w:t>
-      </w:r>
-      <w:r>
-        <w:t>文字或按鈕。點整張結局頁呼叫</w:t>
-      </w:r>
-      <w:r>
-        <w:t xml:space="preserve"> </w:t>
-      </w:r>
+        <w:t>排對後，呈現完整結局頁 final_ending.png（圖內已含「不足為外人道也」與「點擊重遊桃花源」），不另疊 HTML 文字或按鈕。點整張結局頁呼叫 restartGame() 重新開始整個遊戲（術語與第十一節一致）。</w:t>
+      </w:r>
+      <w:r/>
+      <w:r/>
+      <w:proofErr w:type="gramStart"/>
+      <w:r/>
+      <w:proofErr w:type="gramEnd"/>
+      <w:r/>
+      <w:r/>
+      <w:r/>
       <w:proofErr w:type="spellStart"/>
-      <w:r>
-        <w:t>restartGame</w:t>
-      </w:r>
+      <w:r/>
       <w:proofErr w:type="spellEnd"/>
-      <w:r>
-        <w:t>()</w:t>
-      </w:r>
-      <w:r>
-        <w:t>（或等同函式）重新開始整個遊戲。</w:t>
-      </w:r>
+      <w:r/>
+      <w:r/>
     </w:p>
     <w:p>
       <w:r>
@@ -3664,58 +3477,30 @@
     </w:p>
     <w:p>
       <w:r>
-        <w:t>前作結局頁</w:t>
-      </w:r>
-      <w:r>
-        <w:t xml:space="preserve"> village.png </w:t>
-      </w:r>
-      <w:r>
-        <w:t>點擊呼叫的</w:t>
-      </w:r>
-      <w:r>
-        <w:t xml:space="preserve"> </w:t>
-      </w:r>
+        <w:t>本關採用「整合進同一份 index.html、以場景切換實作」的銜接方式：前作結局頁 village.png 點擊呼叫的 enterVillage() 已整合為進入本桃花村關卡，並於本關全部完成後由結局頁的整張點擊呼叫 restartGame() 重新開始整個遊戲。說明文件需註明：檔案結構、如何開啟執行、enterVillage() / restartGame() 的接續位置、互動點與排句資料陣列在哪裡增刪、卡片圖如何替換。</w:t>
+      </w:r>
+      <w:r/>
+      <w:r/>
+      <w:r/>
       <w:proofErr w:type="spellStart"/>
-      <w:r>
-        <w:t>enterVillage</w:t>
-      </w:r>
+      <w:r/>
       <w:proofErr w:type="spellEnd"/>
-      <w:r>
-        <w:t>()</w:t>
-      </w:r>
-      <w:r>
-        <w:t>，改為載入本桃花村關卡。請說明採用哪種銜接方式</w:t>
-      </w:r>
-      <w:proofErr w:type="gramStart"/>
-      <w:r>
-        <w:t>（</w:t>
-      </w:r>
-      <w:proofErr w:type="gramEnd"/>
-      <w:r>
-        <w:t>整合進同一份</w:t>
-      </w:r>
-      <w:r>
-        <w:t xml:space="preserve"> index.html </w:t>
-      </w:r>
-      <w:r>
-        <w:t>用場景切換，或</w:t>
-      </w:r>
-      <w:proofErr w:type="gramStart"/>
-      <w:r>
-        <w:t>跳轉到本關頁</w:t>
-      </w:r>
-      <w:proofErr w:type="gramEnd"/>
-      <w:r>
-        <w:t>面</w:t>
-      </w:r>
-      <w:proofErr w:type="gramStart"/>
-      <w:r>
-        <w:t>）</w:t>
-      </w:r>
-      <w:proofErr w:type="gramEnd"/>
-      <w:r>
-        <w:t>，並在說明文件中註明：檔案結構、如何開啟執行、日後如何增刪互動點與替換圖片、卡片圖如何替換。</w:t>
-      </w:r>
+      <w:r/>
+      <w:r/>
+      <w:proofErr w:type="gramStart"/>
+      <w:r/>
+      <w:proofErr w:type="gramEnd"/>
+      <w:r/>
+      <w:r/>
+      <w:r/>
+      <w:proofErr w:type="gramStart"/>
+      <w:r/>
+      <w:proofErr w:type="gramEnd"/>
+      <w:r/>
+      <w:proofErr w:type="gramStart"/>
+      <w:r/>
+      <w:proofErr w:type="gramEnd"/>
+      <w:r/>
     </w:p>
     <w:p>
       <w:r>
@@ -3765,79 +3550,33 @@
         </w:numPr>
       </w:pPr>
       <w:r>
-        <w:t xml:space="preserve">assets/ </w:t>
-      </w:r>
-      <w:r>
-        <w:t>必須包含</w:t>
-      </w:r>
-      <w:r>
-        <w:t xml:space="preserve"> village_full.png</w:t>
-      </w:r>
-      <w:r>
-        <w:t>、</w:t>
-      </w:r>
-      <w:r>
-        <w:t>npc_elder.png</w:t>
-      </w:r>
-      <w:r>
-        <w:t>、</w:t>
-      </w:r>
-      <w:r>
-        <w:t>npc_farmer.png</w:t>
-      </w:r>
-      <w:r>
-        <w:t>、</w:t>
-      </w:r>
-      <w:r>
-        <w:t>obj_well.png</w:t>
-      </w:r>
-      <w:r>
-        <w:t>、</w:t>
-      </w:r>
-      <w:r>
-        <w:t>obj_feast.png</w:t>
-      </w:r>
-      <w:r>
-        <w:t>、</w:t>
-      </w:r>
-      <w:r>
-        <w:t>farmhouse_interior.png</w:t>
-      </w:r>
-      <w:r>
-        <w:t>、</w:t>
-      </w:r>
-      <w:r>
-        <w:t>npc_villager_humble.png</w:t>
-      </w:r>
-      <w:r>
-        <w:t>、</w:t>
-      </w:r>
-      <w:r>
-        <w:t>village_farewell.png</w:t>
-      </w:r>
-      <w:r>
-        <w:t>、</w:t>
-      </w:r>
-      <w:r>
-        <w:t>card-base-source.png</w:t>
-      </w:r>
-      <w:r>
-        <w:t>（或沿用前作）、</w:t>
-      </w:r>
-      <w:r>
-        <w:t xml:space="preserve">cards/ </w:t>
-      </w:r>
-      <w:r>
-        <w:t>桃花</w:t>
-      </w:r>
-      <w:proofErr w:type="gramStart"/>
-      <w:r>
-        <w:t>村字詞卡</w:t>
-      </w:r>
-      <w:proofErr w:type="gramEnd"/>
-      <w:r>
-        <w:t>全數。</w:t>
-      </w:r>
+        <w:t>assets/ 必須包含 village_full.png、npc_elder.png、npc_farmer.png、obj_well.png、obj_feast.png、farmhouse_interior.png、npc_villager_humble.png、village_exit.png、village_trace.png、final_ending.png、card-base-source.png（或沿用前作）、cards/ 桃花村字詞卡全數。</w:t>
+      </w:r>
+      <w:r/>
+      <w:r/>
+      <w:r/>
+      <w:r/>
+      <w:r/>
+      <w:r/>
+      <w:r/>
+      <w:r/>
+      <w:r/>
+      <w:r/>
+      <w:r/>
+      <w:r/>
+      <w:r/>
+      <w:r/>
+      <w:r/>
+      <w:r/>
+      <w:r/>
+      <w:r/>
+      <w:r/>
+      <w:r/>
+      <w:r/>
+      <w:proofErr w:type="gramStart"/>
+      <w:r/>
+      <w:proofErr w:type="gramEnd"/>
+      <w:r/>
     </w:p>
     <w:p>
       <w:pPr>
@@ -3866,35 +3605,21 @@
         </w:numPr>
       </w:pPr>
       <w:r>
-        <w:t>完成後說明檔案結構、如何開啟執行、</w:t>
+        <w:t>完成後說明檔案結構、如何開啟執行、enterVillage()（接續入村）與 restartGame()（結局後重玩）的位置、互動點與排句資料陣列在哪裡增刪。</w:t>
       </w:r>
       <w:proofErr w:type="spellStart"/>
-      <w:r>
-        <w:t>enterVillage</w:t>
-      </w:r>
+      <w:r/>
       <w:proofErr w:type="spellEnd"/>
-      <w:r>
-        <w:t>()/</w:t>
-      </w:r>
+      <w:r/>
       <w:proofErr w:type="spellStart"/>
-      <w:r>
-        <w:t>restartGame</w:t>
-      </w:r>
+      <w:r/>
       <w:proofErr w:type="spellEnd"/>
-      <w:r>
-        <w:t xml:space="preserve">() </w:t>
-      </w:r>
-      <w:r>
-        <w:t>接續位置、互動點</w:t>
-      </w:r>
-      <w:proofErr w:type="gramStart"/>
-      <w:r>
-        <w:t>與排句資料</w:t>
-      </w:r>
-      <w:proofErr w:type="gramEnd"/>
-      <w:r>
-        <w:t>陣列在哪裡增刪。</w:t>
-      </w:r>
+      <w:r/>
+      <w:r/>
+      <w:proofErr w:type="gramStart"/>
+      <w:r/>
+      <w:proofErr w:type="gramEnd"/>
+      <w:r/>
     </w:p>
     <w:p>
       <w:pPr>
@@ -4043,26 +3768,14 @@
         </w:numPr>
       </w:pPr>
       <w:r>
-        <w:t>結局頁由「純場景圖</w:t>
-      </w:r>
-      <w:r>
-        <w:t xml:space="preserve"> + HTML </w:t>
-      </w:r>
-      <w:r>
-        <w:t>疊字」改為含文字的</w:t>
-      </w:r>
-      <w:r>
-        <w:t xml:space="preserve"> village_farewell.png</w:t>
-      </w:r>
-      <w:r>
-        <w:t>（「不足為外人道也」「點擊重遊桃花源」畫進圖內），不再疊</w:t>
-      </w:r>
-      <w:r>
-        <w:t xml:space="preserve"> HTML </w:t>
-      </w:r>
-      <w:r>
-        <w:t>文字或按鈕。</w:t>
-      </w:r>
+        <w:t>結局頁由「純場景圖 + HTML 疊字」改為含文字的 final_ending.png（「不足為外人道也」「點擊重遊桃花源」畫進圖內），不再疊 HTML 文字或按鈕。</w:t>
+      </w:r>
+      <w:r/>
+      <w:r/>
+      <w:r/>
+      <w:r/>
+      <w:r/>
+      <w:r/>
     </w:p>
     <w:p>
       <w:pPr>

</xml_diff>